<commit_message>
Regenerate the deck against the current product
The deck had drifted badly. Every screenshot predated the app shell, sidebar,
dark theme and filters, so it showed an interface that no longer exists, and it
claimed 86 tests when there are 132. It also never mentioned upload,
persistence, review history or custom playbooks. Submitting it alongside a live
link would have shown an interviewer two different products.

Fresh screenshots driven from the running app, current numbers, and the
swappable playbook noted where it fits. Slide 3 now leads with the whole
application in one frame rather than two stacked strips.

Verified by exporting every slide through PowerPoint: the flagged card grew
taller than the one it replaced and was overlapping its caption, and stacking a
second screenshot under the full-app shot ran off the page. Both corrected.

Generated with Claude Code (https://claude.com/claude-code)
Co-Authored-By: Claude <noreply@anthropic.com>
</commit_message>
<xml_diff>
--- a/docs/Zycus_Redlining_Agent_Writeup.docx
+++ b/docs/Zycus_Redlining_Agent_Writeup.docx
@@ -50,7 +50,7 @@
           <w:color w:val="4A5668"/>
           <w:sz w:val="18"/>
         </w:rPr>
-        <w:t>FastAPI + React  ·  six-step pipeline  ·  three deterministic tools and three model steps  ·  86 tests  ·  about six seconds per review</w:t>
+        <w:t>FastAPI + React  ·  six-step pipeline  ·  three deterministic tools and three model steps  ·  132 tests  ·  about six seconds per review  ·  PDF and Word upload  ·  Postgres audit trail</w:t>
       </w:r>
     </w:p>
     <w:p>
@@ -677,7 +677,7 @@
       <w:r>
         <w:drawing>
           <wp:inline xmlns:a="http://schemas.openxmlformats.org/drawingml/2006/main" xmlns:pic="http://schemas.openxmlformats.org/drawingml/2006/picture">
-            <wp:extent cx="5852160" cy="878958"/>
+            <wp:extent cx="5852160" cy="3667354"/>
             <wp:docPr id="2" name="Picture 2"/>
             <wp:cNvGraphicFramePr>
               <a:graphicFrameLocks noChangeAspect="1"/>
@@ -686,7 +686,7 @@
               <a:graphicData uri="http://schemas.openxmlformats.org/drawingml/2006/picture">
                 <pic:pic>
                   <pic:nvPicPr>
-                    <pic:cNvPr id="0" name="shot-summary.png"/>
+                    <pic:cNvPr id="0" name="new-shell.png"/>
                     <pic:cNvPicPr/>
                   </pic:nvPicPr>
                   <pic:blipFill>
@@ -698,7 +698,7 @@
                   <pic:spPr>
                     <a:xfrm>
                       <a:off x="0" y="0"/>
-                      <a:ext cx="5852160" cy="878958"/>
+                      <a:ext cx="5852160" cy="3667354"/>
                     </a:xfrm>
                     <a:prstGeom prst="rect"/>
                   </pic:spPr>
@@ -720,7 +720,7 @@
           <w:color w:val="4A5668"/>
           <w:sz w:val="17"/>
         </w:rPr>
-        <w:t>The whole contract in one line, before any scrolling.</w:t>
+        <w:t>The application: playbook and audit trail in the rail, an uploaded PDF read into the editor, and the review summarised with filters.</w:t>
       </w:r>
     </w:p>
     <w:p>
@@ -731,7 +731,7 @@
       <w:r>
         <w:drawing>
           <wp:inline xmlns:a="http://schemas.openxmlformats.org/drawingml/2006/main" xmlns:pic="http://schemas.openxmlformats.org/drawingml/2006/picture">
-            <wp:extent cx="5852160" cy="1973403"/>
+            <wp:extent cx="5852160" cy="2153595"/>
             <wp:docPr id="3" name="Picture 3"/>
             <wp:cNvGraphicFramePr>
               <a:graphicFrameLocks noChangeAspect="1"/>
@@ -740,7 +740,7 @@
               <a:graphicData uri="http://schemas.openxmlformats.org/drawingml/2006/picture">
                 <pic:pic>
                   <pic:nvPicPr>
-                    <pic:cNvPr id="0" name="shot-verified.png"/>
+                    <pic:cNvPr id="0" name="new-verified.png"/>
                     <pic:cNvPicPr/>
                   </pic:nvPicPr>
                   <pic:blipFill>
@@ -752,7 +752,7 @@
                   <pic:spPr>
                     <a:xfrm>
                       <a:off x="0" y="0"/>
-                      <a:ext cx="5852160" cy="1973403"/>
+                      <a:ext cx="5852160" cy="2153595"/>
                     </a:xfrm>
                     <a:prstGeom prst="rect"/>
                   </pic:spPr>
@@ -1732,7 +1732,7 @@
       <w:r>
         <w:drawing>
           <wp:inline xmlns:a="http://schemas.openxmlformats.org/drawingml/2006/main" xmlns:pic="http://schemas.openxmlformats.org/drawingml/2006/picture">
-            <wp:extent cx="5486400" cy="1366284"/>
+            <wp:extent cx="5486400" cy="1541678"/>
             <wp:docPr id="4" name="Picture 4"/>
             <wp:cNvGraphicFramePr>
               <a:graphicFrameLocks noChangeAspect="1"/>
@@ -1741,7 +1741,7 @@
               <a:graphicData uri="http://schemas.openxmlformats.org/drawingml/2006/picture">
                 <pic:pic>
                   <pic:nvPicPr>
-                    <pic:cNvPr id="0" name="shot-flagged.png"/>
+                    <pic:cNvPr id="0" name="new-flagged.png"/>
                     <pic:cNvPicPr/>
                   </pic:nvPicPr>
                   <pic:blipFill>
@@ -1753,7 +1753,7 @@
                   <pic:spPr>
                     <a:xfrm>
                       <a:off x="0" y="0"/>
-                      <a:ext cx="5486400" cy="1366284"/>
+                      <a:ext cx="5486400" cy="1541678"/>
                     </a:xfrm>
                     <a:prstGeom prst="rect"/>
                   </pic:spPr>
@@ -2413,7 +2413,7 @@
           <w:color w:val="16202E"/>
           <w:sz w:val="21"/>
         </w:rPr>
-        <w:t>All seven planted breaches are caught and attributed, the two clean clauses draw no false flags, and the suite runs 86 tests of which 66 need no API key at all.</w:t>
+        <w:t>All seven planted breaches are caught and attributed, the two clean clauses draw no false flags, and the suite runs 132 tests of which 96 need no API key at all.</w:t>
       </w:r>
     </w:p>
     <w:p>

</xml_diff>